<commit_message>
Add cover page, table of contents and page numbers to the complete IA
The complete IA now opens with a cover page (title, course, research
question) and a table of contents filled with real page numbers, and has
page numbers in the footer. The written-only version turns inline
formulas into plain text and no longer leaves sentences hanging where a
formula was removed.

Co-Authored-By: Claude Opus 5.5 <noreply@anthropic.com>
Claude-Session: https://claude.ai/code/session_015SCYj96TGcZgc8vCSX2dH8
</commit_message>
<xml_diff>
--- a/math-ia-gini/IA_Complete_Gini_Lorenz_South_Africa_Norway.docx
+++ b/math-ia-gini/IA_Complete_Gini_Lorenz_South_Africa_Norway.docx
@@ -16,6 +16,844 @@
       </w:pPr>
       <w:r>
         <w:t xml:space="preserve">IB Mathematics: Analysis and Approaches SL, Mathematical Exploration</w:t>
+      </w:r>
+    </w:p>
+    <w:p>
+      <w:pPr>
+        <w:pStyle w:val="AbstractTitle"/>
+      </w:pPr>
+      <w:r>
+        <w:t xml:space="preserve">Research question</w:t>
+      </w:r>
+    </w:p>
+    <w:p>
+      <w:pPr>
+        <w:pStyle w:val="Abstract"/>
+      </w:pPr>
+      <w:r>
+        <w:rPr>
+          <w:i/>
+          <w:iCs/>
+        </w:rPr>
+        <w:t xml:space="preserve">To what extent can cubic polynomial regression models and definite calculus integration of Lorenz curves accurately estimate the Gini coefficient of inequality in South Africa compared to Norway, using 2022 World Bank income and consumption distribution data?</w:t>
+      </w:r>
+    </w:p>
+    <w:sdt>
+      <w:sdtPr>
+        <w:docPartObj>
+          <w:docPartGallery w:val="Table of Contents"/>
+          <w:docPartUnique/>
+        </w:docPartObj>
+      </w:sdtPr>
+      <w:sdtContent>
+        <w:p>
+          <w:pPr>
+            <w:pStyle w:val="TOCHeading"/>
+          </w:pPr>
+          <w:r>
+            <w:t xml:space="preserve">Table of contents</w:t>
+          </w:r>
+        </w:p>
+        <w:p>
+          <w:pPr>
+            <w:tabs>
+              <w:tab w:val="right" w:leader="dot" w:pos="9630"/>
+            </w:tabs>
+            <w:spacing w:before="120" w:after="40"/>
+            <w:ind w:left="0"/>
+          </w:pPr>
+          <w:r>
+            <w:fldChar w:fldCharType="begin"/>
+          </w:r>
+          <w:r>
+            <w:instrText xml:space="preserve">TOC \o "1-2" \h \z \u</w:instrText>
+          </w:r>
+          <w:r>
+            <w:fldChar w:fldCharType="separate"/>
+          </w:r>
+          <w:r>
+            <w:rPr>
+              <w:b/>
+            </w:rPr>
+            <w:t xml:space="preserve">1. Introduction</w:t>
+          </w:r>
+          <w:r>
+            <w:rPr>
+              <w:b/>
+            </w:rPr>
+            <w:tab/>
+          </w:r>
+          <w:r>
+            <w:rPr>
+              <w:b/>
+            </w:rPr>
+            <w:t>3</w:t>
+          </w:r>
+        </w:p>
+        <w:p>
+          <w:pPr>
+            <w:tabs>
+              <w:tab w:val="right" w:leader="dot" w:pos="9630"/>
+            </w:tabs>
+            <w:spacing w:before="0" w:after="40"/>
+            <w:ind w:left="440"/>
+          </w:pPr>
+          <w:r>
+            <w:t xml:space="preserve">1.1 Rationale</w:t>
+          </w:r>
+          <w:r>
+            <w:tab/>
+          </w:r>
+          <w:r>
+            <w:t>3</w:t>
+          </w:r>
+        </w:p>
+        <w:p>
+          <w:pPr>
+            <w:tabs>
+              <w:tab w:val="right" w:leader="dot" w:pos="9630"/>
+            </w:tabs>
+            <w:spacing w:before="0" w:after="40"/>
+            <w:ind w:left="440"/>
+          </w:pPr>
+          <w:r>
+            <w:t xml:space="preserve">1.2 Choice of countries</w:t>
+          </w:r>
+          <w:r>
+            <w:tab/>
+          </w:r>
+          <w:r>
+            <w:t>3</w:t>
+          </w:r>
+        </w:p>
+        <w:p>
+          <w:pPr>
+            <w:tabs>
+              <w:tab w:val="right" w:leader="dot" w:pos="9630"/>
+            </w:tabs>
+            <w:spacing w:before="0" w:after="40"/>
+            <w:ind w:left="440"/>
+          </w:pPr>
+          <w:r>
+            <w:t xml:space="preserve">1.3 Hypothesis</w:t>
+          </w:r>
+          <w:r>
+            <w:tab/>
+          </w:r>
+          <w:r>
+            <w:t>3</w:t>
+          </w:r>
+        </w:p>
+        <w:p>
+          <w:pPr>
+            <w:tabs>
+              <w:tab w:val="right" w:leader="dot" w:pos="9630"/>
+            </w:tabs>
+            <w:spacing w:before="0" w:after="40"/>
+            <w:ind w:left="440"/>
+          </w:pPr>
+          <w:r>
+            <w:t xml:space="preserve">1.4 What “accurately” means</w:t>
+          </w:r>
+          <w:r>
+            <w:tab/>
+          </w:r>
+          <w:r>
+            <w:t>3</w:t>
+          </w:r>
+        </w:p>
+        <w:p>
+          <w:pPr>
+            <w:tabs>
+              <w:tab w:val="right" w:leader="dot" w:pos="9630"/>
+            </w:tabs>
+            <w:spacing w:before="120" w:after="40"/>
+            <w:ind w:left="0"/>
+          </w:pPr>
+          <w:r>
+            <w:rPr>
+              <w:b/>
+            </w:rPr>
+            <w:t xml:space="preserve">2. Data collection and methodological caveats</w:t>
+          </w:r>
+          <w:r>
+            <w:rPr>
+              <w:b/>
+            </w:rPr>
+            <w:tab/>
+          </w:r>
+          <w:r>
+            <w:rPr>
+              <w:b/>
+            </w:rPr>
+            <w:t>4</w:t>
+          </w:r>
+        </w:p>
+        <w:p>
+          <w:pPr>
+            <w:tabs>
+              <w:tab w:val="right" w:leader="dot" w:pos="9630"/>
+            </w:tabs>
+            <w:spacing w:before="0" w:after="40"/>
+            <w:ind w:left="440"/>
+          </w:pPr>
+          <w:r>
+            <w:t xml:space="preserve">2.1 Source and checks</w:t>
+          </w:r>
+          <w:r>
+            <w:tab/>
+          </w:r>
+          <w:r>
+            <w:t>4</w:t>
+          </w:r>
+        </w:p>
+        <w:p>
+          <w:pPr>
+            <w:tabs>
+              <w:tab w:val="right" w:leader="dot" w:pos="9630"/>
+            </w:tabs>
+            <w:spacing w:before="0" w:after="40"/>
+            <w:ind w:left="440"/>
+          </w:pPr>
+          <w:r>
+            <w:t xml:space="preserve">2.2 Decile shares and cumulative shares</w:t>
+          </w:r>
+          <w:r>
+            <w:tab/>
+          </w:r>
+          <w:r>
+            <w:t>4</w:t>
+          </w:r>
+        </w:p>
+        <w:p>
+          <w:pPr>
+            <w:tabs>
+              <w:tab w:val="right" w:leader="dot" w:pos="9630"/>
+            </w:tabs>
+            <w:spacing w:before="0" w:after="40"/>
+            <w:ind w:left="440"/>
+          </w:pPr>
+          <w:r>
+            <w:t xml:space="preserve">2.3 Why “income” became “consumption”</w:t>
+          </w:r>
+          <w:r>
+            <w:tab/>
+          </w:r>
+          <w:r>
+            <w:t>5</w:t>
+          </w:r>
+        </w:p>
+        <w:p>
+          <w:pPr>
+            <w:tabs>
+              <w:tab w:val="right" w:leader="dot" w:pos="9630"/>
+            </w:tabs>
+            <w:spacing w:before="120" w:after="40"/>
+            <w:ind w:left="0"/>
+          </w:pPr>
+          <w:r>
+            <w:rPr>
+              <w:b/>
+            </w:rPr>
+            <w:t xml:space="preserve">3. Theoretical foundations</w:t>
+          </w:r>
+          <w:r>
+            <w:rPr>
+              <w:b/>
+            </w:rPr>
+            <w:tab/>
+          </w:r>
+          <w:r>
+            <w:rPr>
+              <w:b/>
+            </w:rPr>
+            <w:t>6</w:t>
+          </w:r>
+        </w:p>
+        <w:p>
+          <w:pPr>
+            <w:tabs>
+              <w:tab w:val="right" w:leader="dot" w:pos="9630"/>
+            </w:tabs>
+            <w:spacing w:before="0" w:after="40"/>
+            <w:ind w:left="440"/>
+          </w:pPr>
+          <w:r>
+            <w:t xml:space="preserve">3.1 Conditions for a valid Lorenz curve</w:t>
+          </w:r>
+          <w:r>
+            <w:tab/>
+          </w:r>
+          <w:r>
+            <w:t>6</w:t>
+          </w:r>
+        </w:p>
+        <w:p>
+          <w:pPr>
+            <w:tabs>
+              <w:tab w:val="right" w:leader="dot" w:pos="9630"/>
+            </w:tabs>
+            <w:spacing w:before="0" w:after="40"/>
+            <w:ind w:left="440"/>
+          </w:pPr>
+          <w:r>
+            <w:t xml:space="preserve">3.2 From area to the Gini formula</w:t>
+          </w:r>
+          <w:r>
+            <w:tab/>
+          </w:r>
+          <w:r>
+            <w:t>6</w:t>
+          </w:r>
+        </w:p>
+        <w:p>
+          <w:pPr>
+            <w:tabs>
+              <w:tab w:val="right" w:leader="dot" w:pos="9630"/>
+            </w:tabs>
+            <w:spacing w:before="120" w:after="40"/>
+            <w:ind w:left="0"/>
+          </w:pPr>
+          <w:r>
+            <w:rPr>
+              <w:b/>
+            </w:rPr>
+            <w:t xml:space="preserve">4. Discrete benchmark: the trapezium rule</w:t>
+          </w:r>
+          <w:r>
+            <w:rPr>
+              <w:b/>
+            </w:rPr>
+            <w:tab/>
+          </w:r>
+          <w:r>
+            <w:rPr>
+              <w:b/>
+            </w:rPr>
+            <w:t>6</w:t>
+          </w:r>
+        </w:p>
+        <w:p>
+          <w:pPr>
+            <w:tabs>
+              <w:tab w:val="right" w:leader="dot" w:pos="9630"/>
+            </w:tabs>
+            <w:spacing w:before="120" w:after="40"/>
+            <w:ind w:left="0"/>
+          </w:pPr>
+          <w:r>
+            <w:rPr>
+              <w:b/>
+            </w:rPr>
+            <w:t xml:space="preserve">5. Model 1: unconstrained least-squares cubic</w:t>
+          </w:r>
+          <w:r>
+            <w:rPr>
+              <w:b/>
+            </w:rPr>
+            <w:tab/>
+          </w:r>
+          <w:r>
+            <w:rPr>
+              <w:b/>
+            </w:rPr>
+            <w:t>7</w:t>
+          </w:r>
+        </w:p>
+        <w:p>
+          <w:pPr>
+            <w:tabs>
+              <w:tab w:val="right" w:leader="dot" w:pos="9630"/>
+            </w:tabs>
+            <w:spacing w:before="0" w:after="40"/>
+            <w:ind w:left="440"/>
+          </w:pPr>
+          <w:r>
+            <w:t xml:space="preserve">5.1 Fitting the model</w:t>
+          </w:r>
+          <w:r>
+            <w:tab/>
+          </w:r>
+          <w:r>
+            <w:t>7</w:t>
+          </w:r>
+        </w:p>
+        <w:p>
+          <w:pPr>
+            <w:tabs>
+              <w:tab w:val="right" w:leader="dot" w:pos="9630"/>
+            </w:tabs>
+            <w:spacing w:before="0" w:after="40"/>
+            <w:ind w:left="440"/>
+          </w:pPr>
+          <w:r>
+            <w:t xml:space="preserve">5.2 Definite integration</w:t>
+          </w:r>
+          <w:r>
+            <w:tab/>
+          </w:r>
+          <w:r>
+            <w:t>9</w:t>
+          </w:r>
+        </w:p>
+        <w:p>
+          <w:pPr>
+            <w:tabs>
+              <w:tab w:val="right" w:leader="dot" w:pos="9630"/>
+            </w:tabs>
+            <w:spacing w:before="0" w:after="40"/>
+            <w:ind w:left="440"/>
+          </w:pPr>
+          <w:r>
+            <w:t xml:space="preserve">5.3 Testing Model 1 against the conditions</w:t>
+          </w:r>
+          <w:r>
+            <w:tab/>
+          </w:r>
+          <w:r>
+            <w:t>9</w:t>
+          </w:r>
+        </w:p>
+        <w:p>
+          <w:pPr>
+            <w:tabs>
+              <w:tab w:val="right" w:leader="dot" w:pos="9630"/>
+            </w:tabs>
+            <w:spacing w:before="0" w:after="40"/>
+            <w:ind w:left="440"/>
+          </w:pPr>
+          <w:r>
+            <w:t xml:space="preserve">5.4 Reflection on R²</w:t>
+          </w:r>
+          <w:r>
+            <w:tab/>
+          </w:r>
+          <w:r>
+            <w:t>10</w:t>
+          </w:r>
+        </w:p>
+        <w:p>
+          <w:pPr>
+            <w:tabs>
+              <w:tab w:val="right" w:leader="dot" w:pos="9630"/>
+            </w:tabs>
+            <w:spacing w:before="120" w:after="40"/>
+            <w:ind w:left="0"/>
+          </w:pPr>
+          <w:r>
+            <w:rPr>
+              <w:b/>
+            </w:rPr>
+            <w:t xml:space="preserve">6. Model 2: constrained cubic through (0, 0) and (1, 1)</w:t>
+          </w:r>
+          <w:r>
+            <w:rPr>
+              <w:b/>
+            </w:rPr>
+            <w:tab/>
+          </w:r>
+          <w:r>
+            <w:rPr>
+              <w:b/>
+            </w:rPr>
+            <w:t>10</w:t>
+          </w:r>
+        </w:p>
+        <w:p>
+          <w:pPr>
+            <w:tabs>
+              <w:tab w:val="right" w:leader="dot" w:pos="9630"/>
+            </w:tabs>
+            <w:spacing w:before="0" w:after="40"/>
+            <w:ind w:left="440"/>
+          </w:pPr>
+          <w:r>
+            <w:t xml:space="preserve">6.1 Applying the constraints</w:t>
+          </w:r>
+          <w:r>
+            <w:tab/>
+          </w:r>
+          <w:r>
+            <w:t>10</w:t>
+          </w:r>
+        </w:p>
+        <w:p>
+          <w:pPr>
+            <w:tabs>
+              <w:tab w:val="right" w:leader="dot" w:pos="9630"/>
+            </w:tabs>
+            <w:spacing w:before="0" w:after="40"/>
+            <w:ind w:left="440"/>
+          </w:pPr>
+          <w:r>
+            <w:t xml:space="preserve">6.2 Why the cubic term has no effect on the area</w:t>
+          </w:r>
+          <w:r>
+            <w:tab/>
+          </w:r>
+          <w:r>
+            <w:t>10</w:t>
+          </w:r>
+        </w:p>
+        <w:p>
+          <w:pPr>
+            <w:tabs>
+              <w:tab w:val="right" w:leader="dot" w:pos="9630"/>
+            </w:tabs>
+            <w:spacing w:before="0" w:after="40"/>
+            <w:ind w:left="440"/>
+          </w:pPr>
+          <w:r>
+            <w:t xml:space="preserve">6.3 Fitting Model 2 by hand</w:t>
+          </w:r>
+          <w:r>
+            <w:tab/>
+          </w:r>
+          <w:r>
+            <w:t>11</w:t>
+          </w:r>
+        </w:p>
+        <w:p>
+          <w:pPr>
+            <w:tabs>
+              <w:tab w:val="right" w:leader="dot" w:pos="9630"/>
+            </w:tabs>
+            <w:spacing w:before="0" w:after="40"/>
+            <w:ind w:left="440"/>
+          </w:pPr>
+          <w:r>
+            <w:t xml:space="preserve">6.4 Testing Model 2 against the conditions</w:t>
+          </w:r>
+          <w:r>
+            <w:tab/>
+          </w:r>
+          <w:r>
+            <w:t>11</w:t>
+          </w:r>
+        </w:p>
+        <w:p>
+          <w:pPr>
+            <w:tabs>
+              <w:tab w:val="right" w:leader="dot" w:pos="9630"/>
+            </w:tabs>
+            <w:spacing w:before="0" w:after="40"/>
+            <w:ind w:left="440"/>
+          </w:pPr>
+          <w:r>
+            <w:t xml:space="preserve">6.5 Reflection: the constrained cubic equals the constrained quadratic</w:t>
+          </w:r>
+          <w:r>
+            <w:tab/>
+          </w:r>
+          <w:r>
+            <w:t>12</w:t>
+          </w:r>
+        </w:p>
+        <w:p>
+          <w:pPr>
+            <w:tabs>
+              <w:tab w:val="right" w:leader="dot" w:pos="9630"/>
+            </w:tabs>
+            <w:spacing w:before="120" w:after="40"/>
+            <w:ind w:left="0"/>
+          </w:pPr>
+          <w:r>
+            <w:rPr>
+              <w:b/>
+            </w:rPr>
+            <w:t xml:space="preserve">7. Comparative error analysis and synthesis</w:t>
+          </w:r>
+          <w:r>
+            <w:rPr>
+              <w:b/>
+            </w:rPr>
+            <w:tab/>
+          </w:r>
+          <w:r>
+            <w:rPr>
+              <w:b/>
+            </w:rPr>
+            <w:t>12</w:t>
+          </w:r>
+        </w:p>
+        <w:p>
+          <w:pPr>
+            <w:tabs>
+              <w:tab w:val="right" w:leader="dot" w:pos="9630"/>
+            </w:tabs>
+            <w:spacing w:before="0" w:after="40"/>
+            <w:ind w:left="440"/>
+          </w:pPr>
+          <w:r>
+            <w:t xml:space="preserve">7.1 Summary of results</w:t>
+          </w:r>
+          <w:r>
+            <w:tab/>
+          </w:r>
+          <w:r>
+            <w:t>12</w:t>
+          </w:r>
+        </w:p>
+        <w:p>
+          <w:pPr>
+            <w:tabs>
+              <w:tab w:val="right" w:leader="dot" w:pos="9630"/>
+            </w:tabs>
+            <w:spacing w:before="0" w:after="40"/>
+            <w:ind w:left="440"/>
+          </w:pPr>
+          <w:r>
+            <w:t xml:space="preserve">7.2 Grouping error and model error</w:t>
+          </w:r>
+          <w:r>
+            <w:tab/>
+          </w:r>
+          <w:r>
+            <w:t>13</w:t>
+          </w:r>
+        </w:p>
+        <w:p>
+          <w:pPr>
+            <w:tabs>
+              <w:tab w:val="right" w:leader="dot" w:pos="9630"/>
+            </w:tabs>
+            <w:spacing w:before="0" w:after="40"/>
+            <w:ind w:left="440"/>
+          </w:pPr>
+          <w:r>
+            <w:t xml:space="preserve">7.3 Why both cubic models underestimate</w:t>
+          </w:r>
+          <w:r>
+            <w:tab/>
+          </w:r>
+          <w:r>
+            <w:t>13</w:t>
+          </w:r>
+        </w:p>
+        <w:p>
+          <w:pPr>
+            <w:tabs>
+              <w:tab w:val="right" w:leader="dot" w:pos="9630"/>
+            </w:tabs>
+            <w:spacing w:before="0" w:after="40"/>
+            <w:ind w:left="440"/>
+          </w:pPr>
+          <w:r>
+            <w:t xml:space="preserve">7.4 Testing the hypothesis</w:t>
+          </w:r>
+          <w:r>
+            <w:tab/>
+          </w:r>
+          <w:r>
+            <w:t>13</w:t>
+          </w:r>
+        </w:p>
+        <w:p>
+          <w:pPr>
+            <w:tabs>
+              <w:tab w:val="right" w:leader="dot" w:pos="9630"/>
+            </w:tabs>
+            <w:spacing w:before="120" w:after="40"/>
+            <w:ind w:left="0"/>
+          </w:pPr>
+          <w:r>
+            <w:rPr>
+              <w:b/>
+            </w:rPr>
+            <w:t xml:space="preserve">8. Critical evaluation, extensions and conclusion</w:t>
+          </w:r>
+          <w:r>
+            <w:rPr>
+              <w:b/>
+            </w:rPr>
+            <w:tab/>
+          </w:r>
+          <w:r>
+            <w:rPr>
+              <w:b/>
+            </w:rPr>
+            <w:t>14</w:t>
+          </w:r>
+        </w:p>
+        <w:p>
+          <w:pPr>
+            <w:tabs>
+              <w:tab w:val="right" w:leader="dot" w:pos="9630"/>
+            </w:tabs>
+            <w:spacing w:before="0" w:after="40"/>
+            <w:ind w:left="440"/>
+          </w:pPr>
+          <w:r>
+            <w:t xml:space="preserve">8.1 Strengths</w:t>
+          </w:r>
+          <w:r>
+            <w:tab/>
+          </w:r>
+          <w:r>
+            <w:t>14</w:t>
+          </w:r>
+        </w:p>
+        <w:p>
+          <w:pPr>
+            <w:tabs>
+              <w:tab w:val="right" w:leader="dot" w:pos="9630"/>
+            </w:tabs>
+            <w:spacing w:before="0" w:after="40"/>
+            <w:ind w:left="440"/>
+          </w:pPr>
+          <w:r>
+            <w:t xml:space="preserve">8.2 Limitations</w:t>
+          </w:r>
+          <w:r>
+            <w:tab/>
+          </w:r>
+          <w:r>
+            <w:t>14</w:t>
+          </w:r>
+        </w:p>
+        <w:p>
+          <w:pPr>
+            <w:tabs>
+              <w:tab w:val="right" w:leader="dot" w:pos="9630"/>
+            </w:tabs>
+            <w:spacing w:before="0" w:after="40"/>
+            <w:ind w:left="440"/>
+          </w:pPr>
+          <w:r>
+            <w:t xml:space="preserve">8.3 Extensions</w:t>
+          </w:r>
+          <w:r>
+            <w:tab/>
+          </w:r>
+          <w:r>
+            <w:t>14</w:t>
+          </w:r>
+        </w:p>
+        <w:p>
+          <w:pPr>
+            <w:tabs>
+              <w:tab w:val="right" w:leader="dot" w:pos="9630"/>
+            </w:tabs>
+            <w:spacing w:before="0" w:after="40"/>
+            <w:ind w:left="440"/>
+          </w:pPr>
+          <w:r>
+            <w:t xml:space="preserve">8.4 Conclusion</w:t>
+          </w:r>
+          <w:r>
+            <w:tab/>
+          </w:r>
+          <w:r>
+            <w:t>15</w:t>
+          </w:r>
+        </w:p>
+        <w:p>
+          <w:pPr>
+            <w:tabs>
+              <w:tab w:val="right" w:leader="dot" w:pos="9630"/>
+            </w:tabs>
+            <w:spacing w:before="0" w:after="40"/>
+            <w:ind w:left="440"/>
+          </w:pPr>
+          <w:r>
+            <w:t xml:space="preserve">8.5 Declaration of tools used</w:t>
+          </w:r>
+          <w:r>
+            <w:tab/>
+          </w:r>
+          <w:r>
+            <w:t>15</w:t>
+          </w:r>
+        </w:p>
+        <w:p>
+          <w:pPr>
+            <w:tabs>
+              <w:tab w:val="right" w:leader="dot" w:pos="9630"/>
+            </w:tabs>
+            <w:spacing w:before="120" w:after="40"/>
+            <w:ind w:left="0"/>
+          </w:pPr>
+          <w:r>
+            <w:rPr>
+              <w:b/>
+            </w:rPr>
+            <w:t xml:space="preserve">References</w:t>
+          </w:r>
+          <w:r>
+            <w:rPr>
+              <w:b/>
+            </w:rPr>
+            <w:tab/>
+          </w:r>
+          <w:r>
+            <w:rPr>
+              <w:b/>
+            </w:rPr>
+            <w:t>15</w:t>
+          </w:r>
+        </w:p>
+        <w:p>
+          <w:pPr>
+            <w:tabs>
+              <w:tab w:val="right" w:leader="dot" w:pos="9630"/>
+            </w:tabs>
+            <w:spacing w:before="120" w:after="40"/>
+            <w:ind w:left="0"/>
+          </w:pPr>
+          <w:r>
+            <w:rPr>
+              <w:b/>
+            </w:rPr>
+            <w:t xml:space="preserve">Appendix A. The 2022 data</w:t>
+          </w:r>
+          <w:r>
+            <w:rPr>
+              <w:b/>
+            </w:rPr>
+            <w:tab/>
+          </w:r>
+          <w:r>
+            <w:rPr>
+              <w:b/>
+            </w:rPr>
+            <w:t>16</w:t>
+          </w:r>
+        </w:p>
+        <w:p>
+          <w:pPr>
+            <w:tabs>
+              <w:tab w:val="right" w:leader="dot" w:pos="9630"/>
+            </w:tabs>
+            <w:spacing w:before="120" w:after="40"/>
+            <w:ind w:left="0"/>
+          </w:pPr>
+          <w:r>
+            <w:rPr>
+              <w:b/>
+            </w:rPr>
+            <w:t xml:space="preserve">Appendix B. Model 2 working</w:t>
+          </w:r>
+          <w:r>
+            <w:rPr>
+              <w:b/>
+            </w:rPr>
+            <w:tab/>
+          </w:r>
+          <w:r>
+            <w:rPr>
+              <w:b/>
+            </w:rPr>
+            <w:t>16</w:t>
+          </w:r>
+          <w:r>
+            <w:fldChar w:fldCharType="end"/>
+          </w:r>
+        </w:p>
+      </w:sdtContent>
+    </w:sdt>
+    <w:p>
+      <w:r>
+        <w:br w:type="page"/>
       </w:r>
     </w:p>
     <w:p>
@@ -3579,7 +4417,7 @@
         </m:r>
       </m:oMath>
       <w:r>
-        <w:t xml:space="preserve">, so</w:t>
+        <w:t xml:space="preserve">, so the Gini coefficient is one minus twice the area under the Lorenz curve:</w:t>
       </w:r>
     </w:p>
     <w:p>
@@ -5243,7 +6081,7 @@
         <w:pStyle w:val="FirstParagraph"/>
       </w:pPr>
       <w:r>
-        <w:t xml:space="preserve">I used cubic regression on all 11 points, which is the same calculation as the cubic regression function on a GDC, and got</w:t>
+        <w:t xml:space="preserve">I used cubic regression on all 11 points, which is the same calculation as the cubic regression function on a GDC. The fitted models were:</w:t>
       </w:r>
     </w:p>
     <w:p>
@@ -8199,7 +9037,7 @@
         <w:pStyle w:val="FirstParagraph"/>
       </w:pPr>
       <w:r>
-        <w:t xml:space="preserve">Integrating term by term,</w:t>
+        <w:t xml:space="preserve">Integrating term by term gives the area under the cubic:</w:t>
       </w:r>
     </w:p>
     <w:p>
@@ -10059,7 +10897,7 @@
         </m:r>
       </m:oMath>
       <w:r>
-        <w:t xml:space="preserve">. Substituting,</w:t>
+        <w:t xml:space="preserve">. Substituting these into the cubic gives:</w:t>
       </w:r>
     </w:p>
     <w:p>
@@ -10421,7 +11259,7 @@
         </m:r>
       </m:oMath>
       <w:r>
-        <w:t xml:space="preserve">, which can be checked by expanding the right-hand side. This lets me rewrite the model as</w:t>
+        <w:t xml:space="preserve">, which can be checked by expanding the right-hand side. This lets me rewrite the model in the following form:</w:t>
       </w:r>
     </w:p>
     <w:p>
@@ -10685,7 +11523,7 @@
         <w:pStyle w:val="FirstParagraph"/>
       </w:pPr>
       <w:r>
-        <w:t xml:space="preserve">where</w:t>
+        <w:t xml:space="preserve">Here</w:t>
       </w:r>
       <w:r>
         <w:t xml:space="preserve"> </w:t>
@@ -11968,7 +12806,7 @@
         </m:r>
       </m:oMath>
       <w:r>
-        <w:t xml:space="preserve">, and so on). This means the sum of squared residuals splits into one part that contains only β and another that contains only α. Each part is a quadratic, so I minimised it by differentiating and setting the derivative equal to zero, which gives</w:t>
+        <w:t xml:space="preserve">, and so on). This means the sum of squared residuals splits into one part that contains only β and another that contains only α. Each part is a quadratic, so I minimised it by differentiating and setting the derivative equal to zero. This gives the two coefficients:</w:t>
       </w:r>
     </w:p>
     <w:p>
@@ -19663,6 +20501,8 @@
     </w:tbl>
     <w:bookmarkEnd w:id="55"/>
     <w:sectPr>
+      <w:footerReference r:id="rIdFooter1" w:type="default"/>
+      <w:titlePg/>
       <w:footnotePr>
         <w:numRestart w:val="eachSect"/>
       </w:footnotePr>
@@ -19675,6 +20515,31 @@
 
 <file path=word/comments.xml><?xml version="1.0" encoding="utf-8"?>
 <w:comments xmlns:w="http://schemas.openxmlformats.org/wordprocessingml/2006/main" xmlns:m="http://schemas.openxmlformats.org/officeDocument/2006/math" xmlns:r="http://schemas.openxmlformats.org/officeDocument/2006/relationships" xmlns:o="urn:schemas-microsoft-com:office:office" xmlns:v="urn:schemas-microsoft-com:vml" xmlns:w10="urn:schemas-microsoft-com:office:word" xmlns:a="http://schemas.openxmlformats.org/drawingml/2006/main" xmlns:pic="http://schemas.openxmlformats.org/drawingml/2006/picture" xmlns:wp="http://schemas.openxmlformats.org/drawingml/2006/wordprocessingDrawing"/>
+</file>
+
+<file path=word/footer1.xml><?xml version="1.0" encoding="utf-8"?>
+<w:ftr xmlns:w="http://schemas.openxmlformats.org/wordprocessingml/2006/main" xmlns:r="http://schemas.openxmlformats.org/officeDocument/2006/relationships">
+  <w:p>
+    <w:pPr>
+      <w:jc w:val="center"/>
+    </w:pPr>
+    <w:r>
+      <w:fldChar w:fldCharType="begin"/>
+    </w:r>
+    <w:r>
+      <w:instrText xml:space="preserve"> PAGE </w:instrText>
+    </w:r>
+    <w:r>
+      <w:fldChar w:fldCharType="separate"/>
+    </w:r>
+    <w:r>
+      <w:t>1</w:t>
+    </w:r>
+    <w:r>
+      <w:fldChar w:fldCharType="end"/>
+    </w:r>
+  </w:p>
+</w:ftr>
 </file>
 
 <file path=word/footnotes.xml><?xml version="1.0" encoding="utf-8"?>
@@ -19838,7 +20703,7 @@
     <w:qFormat/>
     <w:rsid w:val="00A10FD9"/>
     <w:pPr>
-      <w:spacing w:after="80" w:line="240" w:lineRule="auto"/>
+      <w:spacing w:after="400" w:before="3600" w:line="240" w:lineRule="auto"/>
       <w:contextualSpacing/>
       <w:jc w:val="center"/>
     </w:pPr>
@@ -19930,13 +20795,13 @@
     <w:pPr>
       <w:keepNext/>
       <w:keepLines/>
-      <w:spacing w:after="0" w:before="300"/>
+      <w:spacing w:after="0" w:before="1200"/>
       <w:jc w:val="center"/>
     </w:pPr>
     <w:rPr>
       <w:b/>
-      <w:sz w:val="20"/>
-      <w:szCs w:val="20"/>
+      <w:sz w:val="24"/>
+      <w:szCs w:val="24"/>
     </w:rPr>
   </w:style>
   <w:style w:customStyle="1" w:styleId="Abstract" w:type="paragraph">
@@ -19947,11 +20812,13 @@
     <w:pPr>
       <w:keepNext/>
       <w:keepLines/>
-      <w:spacing w:after="300" w:before="100"/>
+      <w:spacing w:after="300" w:before="120" w:line="300" w:lineRule="auto"/>
+      <w:ind w:left="720" w:right="720"/>
+      <w:jc w:val="center"/>
     </w:pPr>
     <w:rPr>
-      <w:sz w:val="20"/>
-      <w:szCs w:val="20"/>
+      <w:sz w:val="24"/>
+      <w:szCs w:val="24"/>
     </w:rPr>
   </w:style>
   <w:style w:styleId="Bibliography" w:type="paragraph">
@@ -20430,6 +21297,7 @@
     <w:unhideWhenUsed/>
     <w:qFormat/>
     <w:pPr>
+      <w:pageBreakBefore/>
       <w:spacing w:before="240" w:line="259" w:lineRule="auto"/>
       <w:outlineLvl w:val="9"/>
     </w:pPr>

</xml_diff>